<commit_message>
feat: create Anclora-Age project
</commit_message>
<xml_diff>
--- a/triumph-renta-mallorca-SEO/Reutilizables/Generated_Templates/Plantilla_Resumen_Ejecutivo_ES.docx
+++ b/triumph-renta-mallorca-SEO/Reutilizables/Generated_Templates/Plantilla_Resumen_Ejecutivo_ES.docx
@@ -21,7 +21,7 @@
         <w:rPr/>
         <w:drawing>
           <wp:inline distT="0" distB="0" distL="0" distR="0">
-            <wp:extent cx="5715000" cy="9622790"/>
+            <wp:extent cx="5715000" cy="8545195"/>
             <wp:effectExtent l="0" t="0" r="0" b="0"/>
             <wp:docPr id="1" name="Image1" descr=""/>
             <wp:cNvGraphicFramePr>
@@ -45,7 +45,7 @@
                   <pic:spPr bwMode="auto">
                     <a:xfrm>
                       <a:off x="0" y="0"/>
-                      <a:ext cx="5715000" cy="9622790"/>
+                      <a:ext cx="5715000" cy="8545195"/>
                     </a:xfrm>
                     <a:prstGeom prst="rect">
                       <a:avLst/>
@@ -95,31 +95,32 @@
       </w:r>
       <w:r>
         <w:rPr/>
+        <w:t>TOC \h \o "1-3"</w:t>
+      </w:r>
+    </w:p>
+    <w:p>
+      <w:pPr>
+        <w:pStyle w:val="Normal"/>
+        <w:rPr/>
+      </w:pPr>
+      <w:r>
+        <w:rPr/>
+      </w:r>
+      <w:r>
+        <w:rPr/>
+        <w:fldChar w:fldCharType="end"/>
       </w:r>
       <w:sdt>
-        <w:sdtPr>
-          <w:alias w:val="Contenidos"/>
-        </w:sdtPr>
+        <w:sdtPr/>
         <w:sdtContent>
           <w:r>
             <w:rPr/>
-            <w:t>TOC \h \o "1-3"</w:t>
+          </w:r>
+          <w:r>
+            <w:rPr/>
           </w:r>
         </w:sdtContent>
       </w:sdt>
-    </w:p>
-    <w:p>
-      <w:pPr>
-        <w:pStyle w:val="Normal"/>
-        <w:rPr/>
-      </w:pPr>
-      <w:r>
-        <w:rPr/>
-      </w:r>
-      <w:r>
-        <w:rPr/>
-        <w:fldChar w:fldCharType="end"/>
-      </w:r>
     </w:p>
     <w:p>
       <w:pPr>
@@ -452,6 +453,7 @@
     <w:qFormat/>
     <w:pPr>
       <w:widowControl/>
+      <w:suppressAutoHyphens w:val="true"/>
       <w:bidi w:val="0"/>
       <w:spacing w:before="0" w:after="0"/>
       <w:jc w:val="left"/>
@@ -643,6 +645,7 @@
     <w:qFormat/>
     <w:pPr>
       <w:widowControl/>
+      <w:suppressAutoHyphens w:val="true"/>
       <w:bidi w:val="0"/>
       <w:spacing w:before="0" w:after="0"/>
       <w:jc w:val="left"/>
@@ -663,6 +666,7 @@
     <w:qFormat/>
     <w:pPr>
       <w:widowControl/>
+      <w:suppressAutoHyphens w:val="true"/>
       <w:bidi w:val="0"/>
       <w:spacing w:before="0" w:after="0"/>
       <w:jc w:val="left"/>

</xml_diff>